<commit_message>
revision of word document
</commit_message>
<xml_diff>
--- a/Git Best practices.docx
+++ b/Git Best practices.docx
@@ -10,6 +10,55 @@
         <w:t>Git Best practices</w:t>
       </w:r>
     </w:p>
+    <w:p>
+      <w:pPr>
+        <w:jc w:val="center"/>
+      </w:pPr>
+      <w:r>
+        <w:t xml:space="preserve">When I’m working with Git, I try to stick to habits that keep my projects organized and easy to manage. I’ve learned that making small, frequent commits with clear messages helps me keep track of what I </w:t>
+      </w:r>
+      <w:proofErr w:type="gramStart"/>
+      <w:r>
+        <w:t>actually changed</w:t>
+      </w:r>
+      <w:proofErr w:type="gramEnd"/>
+      <w:r>
+        <w:t xml:space="preserve"> and why I did it. I also like using separate branches for different features or fixes, so I don’t accidentally break my main branch. Before committing anything, I check git status and git </w:t>
+      </w:r>
+      <w:proofErr w:type="gramStart"/>
+      <w:r>
+        <w:t>diff</w:t>
+      </w:r>
+      <w:proofErr w:type="gramEnd"/>
+      <w:r>
+        <w:t xml:space="preserve"> so I don’t push random files I didn’t mean to include. Keeping a </w:t>
+      </w:r>
+      <w:proofErr w:type="gramStart"/>
+      <w:r>
+        <w:t xml:space="preserve">good </w:t>
+      </w:r>
+      <w:r>
+        <w:t>.</w:t>
+      </w:r>
+      <w:proofErr w:type="spellStart"/>
+      <w:r>
+        <w:t>gitignore</w:t>
+      </w:r>
+      <w:proofErr w:type="spellEnd"/>
+      <w:proofErr w:type="gramEnd"/>
+      <w:r>
+        <w:t xml:space="preserve"> file has saved me from cluttering my repo with unnecessary stuff. I’ve also noticed that pulling updates regularly makes </w:t>
+      </w:r>
+      <w:proofErr w:type="gramStart"/>
+      <w:r>
+        <w:t>merge</w:t>
+      </w:r>
+      <w:proofErr w:type="gramEnd"/>
+      <w:r>
+        <w:t xml:space="preserve"> conflicts way less painful. Overall, these simple practices make Git feel a lot more manageable and keep my workflow running smoothly.</w:t>
+      </w:r>
+    </w:p>
+    <w:p/>
     <w:sectPr>
       <w:pgSz w:w="12240" w:h="15840"/>
       <w:pgMar w:top="1440" w:right="1440" w:bottom="1440" w:left="1440" w:header="720" w:footer="720" w:gutter="0"/>
@@ -420,6 +469,7 @@
   <w:style w:type="paragraph" w:default="1" w:styleId="Normal">
     <w:name w:val="Normal"/>
     <w:qFormat/>
+    <w:rsid w:val="00412EC5"/>
   </w:style>
   <w:style w:type="paragraph" w:styleId="Heading1">
     <w:name w:val="heading 1"/>

</xml_diff>